<commit_message>
Corrige integrantes e explicita linearização no EX03
</commit_message>
<xml_diff>
--- a/FisicaEx03/Relatorio_Final.docx
+++ b/FisicaEx03/Relatorio_Final.docx
@@ -26,19 +26,30 @@
     </w:p>
     <w:p>
       <w:pPr>
-        <w:pStyle w:val="Autor"/>
-        <w:spacing w:before="700"/>
-      </w:pPr>
-      <w:r>
+        <w:pStyle w:val="Ttulodotrabalho"/>
+        <w:spacing w:before="1040"/>
+        <w:rPr>
+          <w:rFonts w:ascii="Times New Roman" w:hAnsi="Times New Roman"/>
+          <w:b w:val="0"/>
+          <w:szCs w:val="28"/>
+        </w:rPr>
+      </w:pPr>
+      <w:r>
+        <w:rPr>
+          <w:rFonts w:ascii="Times New Roman" w:hAnsi="Times New Roman"/>
+          <w:b w:val="0"/>
+          <w:szCs w:val="28"/>
+        </w:rPr>
         <w:t>Heitor Yochida de Ávila</w:t>
       </w:r>
       <w:r>
+        <w:rPr>
+          <w:rFonts w:ascii="Times New Roman" w:hAnsi="Times New Roman"/>
+          <w:b w:val="0"/>
+          <w:szCs w:val="28"/>
+        </w:rPr>
         <w:br/>
-        <w:t>Sofia Skolimoski</w:t>
-      </w:r>
-      <w:r>
-        <w:br/>
-        <w:t>Tiago de Almeida Raile</w:t>
+        <w:t>Jonathan Alves de Freitas das Neves Souza</w:t>
       </w:r>
     </w:p>
     <w:p>
@@ -146,6 +157,9 @@
         <w:spacing w:after="140" w:line="240" w:lineRule="auto"/>
         <w:ind w:left="4592" w:firstLine="0"/>
         <w:jc w:val="left"/>
+        <w:rPr>
+          <w:rFonts w:ascii="Arial" w:hAnsi="Arial"/>
+        </w:rPr>
       </w:pPr>
       <w:r>
         <w:rPr>
@@ -165,14 +179,7 @@
           <w:rFonts w:ascii="Arial" w:hAnsi="Arial"/>
         </w:rPr>
         <w:br/>
-        <w:t>12621ETE001</w:t>
-      </w:r>
-      <w:r>
-        <w:rPr>
-          <w:rFonts w:ascii="Arial" w:hAnsi="Arial"/>
-        </w:rPr>
-        <w:br/>
-        <w:t>12621EAU003</w:t>
+        <w:t>12621ETE007</w:t>
       </w:r>
     </w:p>
     <w:p>
@@ -231,13 +238,7 @@
     </w:p>
     <w:p>
       <w:r>
-        <w:t xml:space="preserve">Investigou-se a queda livre por meio de 51 leituras de tempo em 17 alturas entre 10 e 90 cm. Para cada altura, calculou-se o tempo médio e sua incerteza, combinando o desvio padrão da média com a contribuição instrumental de 0,0001 s. A altura foi tratada sem incerteza considerada, conforme o registro do experimento. A relação entre as grandezas foi analisada por linearização logarítmica e por ajuste de t² em função da altura. O ajuste de potência com expoente livre forneceu n = 2,108 ± 0,002 e C = (5,31 ± </w:t>
-      </w:r>
-      <w:r>
-        <w:t>0,01) m para d = C(t/1 s)ⁿ. Ao impor n = 2, os ajustes logarítmico e de t² pela origem forneceram, respectivamente, g = (9,468 ± 0,003) m/s² e g = (9,475 ± 0,003) m/s². Os qui-quadrados reduzidos, superiores a 300 nesses modelos restritos, mostram que suas incertezas formais não expressam a dispersão total dos dados. Um ajuste adicional com intercepto livre reduziu o qui-quadrado reduzido para 3,08 e forneceu g = (9,878 ± 0,007) m/s², sem identificar a origem física do intercepto. Os resultados caracterizam</w:t>
-      </w:r>
-      <w:r>
-        <w:t xml:space="preserve"> as medidas obtidas e os limites das hipóteses empregadas.</w:t>
+        <w:t>Investigou-se a queda livre por meio de 51 leituras de tempo em 17 alturas entre 10 e 90 cm. Para cada altura, calculou-se o tempo médio e sua incerteza, combinando o desvio padrão da média com a contribuição instrumental de 0,0001 s. A altura foi tratada sem incerteza considerada, conforme o registro do experimento. A relação entre as grandezas foi analisada por linearização logarítmica e por ajuste de t² em função da altura. O ajuste de potência com expoente livre forneceu n = 2,108 ± 0,002 e C = (5,31 ± 0,01) m para d = C(t/1 s)ⁿ. Ao impor n = 2, os ajustes logarítmico e de t² pela origem forneceram, respectivamente, g = (9,468 ± 0,003) m/s² e g = (9,475 ± 0,003) m/s². Os qui-quadrados reduzidos, superiores a 300 nesses modelos restritos, mostram que suas incertezas formais não expressam a dispersão total dos dados. Um ajuste adicional com intercepto livre reduziu o qui-quadrado reduzido para 3,08 e forneceu g = (9,878 ± 0,007) m/s², sem identificar a origem física do intercepto. Os resultados caracterizam as medidas obtidas e os limites das hipóteses empregadas.</w:t>
       </w:r>
     </w:p>
     <w:p>
@@ -944,11 +945,6 @@
       </w:r>
     </w:p>
     <w:p>
-      <w:r>
-        <w:t>Escreve-se a hipótese empírica como d = C(t̄/1 s)ⁿ, com C em metros e n adimensional. A transformação logarítmica produziria ln(d/1 m) = ln(C/1 m) + n ln(t̄/1 s). Como só o tempo recebeu incerteza no tratamento, a regressão ponderada é orientada no sentido inverso, mantendo o tempo no eixo vertical:</w:t>
-      </w:r>
-    </w:p>
-    <w:p>
       <w:pPr>
         <w:keepLines/>
         <w:tabs>
@@ -957,15 +953,32 @@
         <w:jc w:val="center"/>
       </w:pPr>
       <w:r>
+        <w:t>Escreve-se a hipótese empírica como d = C(t̄/1 s)ⁿ, com C em metros e n adimensional. A transformação logarítmica produz ln(d/1 m) = ln(C/1 m) + n ln(t̄/1 s). No modelo ideal, n = 2, A = ln[g/(2 m/s²)] e g = (2 m/s²) exp(A), pela linearização direta. Como só o tempo recebeu incerteza no tratamento, a regressão ponderada é orientada no sentido inverso, mantendo o tempo no eixo vertical:</w:t>
+      </w:r>
+    </w:p>
+    <w:p>
+      <w:pPr>
+        <w:keepLines/>
+        <w:tabs>
+          <w:tab w:val="right" w:pos="8504"/>
+        </w:tabs>
+        <w:jc w:val="center"/>
+        <w:rPr>
+          <w:lang w:val="en-US"/>
+        </w:rPr>
+      </w:pPr>
+      <w:r>
         <w:rPr>
           <w:rFonts w:ascii="Cambria Math" w:hAnsi="Cambria Math"/>
           <w:sz w:val="22"/>
+          <w:lang w:val="en-US"/>
         </w:rPr>
         <w:t>X = ln(d/1 m);  Y = ln(t̄/1 s);  Y = aX + b</w:t>
       </w:r>
       <w:r>
         <w:rPr>
           <w:sz w:val="20"/>
+          <w:lang w:val="en-US"/>
         </w:rPr>
         <w:tab/>
         <w:t>(4)</w:t>
@@ -9813,7 +9826,16 @@
     </w:p>
     <w:p>
       <w:r>
-        <w:t>SOUSA, Lucas Soares. Aula 2 – Laboratório de Física 1. [S. l.: s. n.], [s. d.]. 19 slides. Material de aula sobre propagação de incertezas, linearização e regressão linear.</w:t>
+        <w:t xml:space="preserve">SOUSA, Lucas Soares. Aula 2 – Laboratório de Física 1. </w:t>
+      </w:r>
+      <w:r>
+        <w:rPr>
+          <w:lang w:val="en-US"/>
+        </w:rPr>
+        <w:t xml:space="preserve">[S. l.: s. n.], [s. d.]. 19 slides. </w:t>
+      </w:r>
+      <w:r>
+        <w:t>Material de aula sobre propagação de incertezas, linearização e regressão linear.</w:t>
       </w:r>
     </w:p>
     <w:sectPr>

</xml_diff>

<commit_message>
Adiciona registro fotográfico da montagem ao EX03
</commit_message>
<xml_diff>
--- a/FisicaEx03/Relatorio_Final.docx
+++ b/FisicaEx03/Relatorio_Final.docx
@@ -376,6 +376,72 @@
     </w:p>
     <w:p>
       <w:pPr>
+        <w:tabs>
+          <w:tab w:val="right" w:leader="dot" w:pos="8504"/>
+        </w:tabs>
+        <w:spacing w:line="240" w:lineRule="auto"/>
+        <w:ind w:firstLine="0"/>
+      </w:pPr>
+      <w:r>
+        <w:rPr>
+          <w:sz w:val="20"/>
+        </w:rPr>
+        <w:t>Figura 6 – Visão geral da montagem experimental</w:t>
+      </w:r>
+      <w:r>
+        <w:rPr>
+          <w:sz w:val="20"/>
+        </w:rPr>
+        <w:tab/>
+        <w:t>17</w:t>
+      </w:r>
+    </w:p>
+    <w:p>
+      <w:pPr>
+        <w:tabs>
+          <w:tab w:val="right" w:leader="dot" w:pos="8504"/>
+        </w:tabs>
+        <w:spacing w:line="240" w:lineRule="auto"/>
+        <w:ind w:firstLine="0"/>
+      </w:pPr>
+      <w:r>
+        <w:rPr>
+          <w:sz w:val="20"/>
+        </w:rPr>
+        <w:t>Figura 7 – Esfera, suporte e plataforma de parada</w:t>
+      </w:r>
+      <w:r>
+        <w:rPr>
+          <w:sz w:val="20"/>
+        </w:rPr>
+        <w:tab/>
+        <w:t>18</w:t>
+      </w:r>
+    </w:p>
+    <w:p>
+      <w:pPr>
+        <w:tabs>
+          <w:tab w:val="right" w:leader="dot" w:pos="8504"/>
+        </w:tabs>
+        <w:spacing w:line="240" w:lineRule="auto"/>
+        <w:ind w:firstLine="0"/>
+      </w:pPr>
+      <w:r>
+        <w:rPr>
+          <w:sz w:val="20"/>
+        </w:rPr>
+        <w:t>Figura 8 – Unidade de cronometragem</w:t>
+      </w:r>
+      <w:r>
+        <w:rPr>
+          <w:sz w:val="20"/>
+        </w:rPr>
+        <w:tab/>
+        <w:t>18</w:t>
+      </w:r>
+    </w:p>
+    <w:p>
+      <w:pPr>
         <w:pStyle w:val="Resumo"/>
         <w:spacing w:before="480" w:after="320"/>
       </w:pPr>
@@ -804,6 +870,30 @@
         </w:rPr>
         <w:tab/>
         <w:t>16</w:t>
+      </w:r>
+    </w:p>
+    <w:p>
+      <w:pPr>
+        <w:tabs>
+          <w:tab w:val="right" w:leader="dot" w:pos="8504"/>
+        </w:tabs>
+        <w:spacing w:line="240" w:lineRule="auto"/>
+        <w:ind w:firstLine="0"/>
+      </w:pPr>
+      <w:r>
+        <w:rPr>
+          <w:b/>
+          <w:sz w:val="20"/>
+        </w:rPr>
+        <w:t>APÊNDICE A – REGISTRO FOTOGRÁFICO DA MONTAGEM</w:t>
+      </w:r>
+      <w:r>
+        <w:rPr>
+          <w:b/>
+          <w:sz w:val="20"/>
+        </w:rPr>
+        <w:tab/>
+        <w:t>17</w:t>
       </w:r>
     </w:p>
     <w:p>
@@ -1064,7 +1154,7 @@
     </w:p>
     <w:p>
       <w:r>
-        <w:t>O roteiro do capítulo 12 descreve uma esfera metálica mantida por disparador eletromagnético, uma haste graduada, um cronômetro e uma plataforma de parada. A soltura inicia a contagem, encerrada no impacto. Esse é o arranjo prescrito pela apostila; o grupo forneceu as folhas de medições, sem fotografias da montagem, de modo que detalhes particulares do aparelho não são inferidos das imagens de anotações.</w:t>
+        <w:t>O roteiro do capítulo 12 descreve uma esfera metálica mantida por disparador eletromagnético, uma haste graduada, um cronômetro e uma plataforma de parada. A soltura inicia a contagem, encerrada no impacto. As fotografias fornecidas pelo grupo documentam a montagem utilizada e são apresentadas no Apêndice A. Elas mostram a haste, o suporte da esfera, a base e a unidade de cronometragem, sem permitir concluir ajustes ou calibração que não foram registrados.</w:t>
       </w:r>
     </w:p>
     <w:p>
@@ -9821,7 +9911,7 @@
     </w:p>
     <w:p>
       <w:r>
-        <w:t>REGISTRO de medidas do trabalho 03 de Física Geral Experimental I. Uberlândia, 6 out. 2026. Planilha medidas_fisicaEX03.xlsx e duas fotografias das anotações. Conferido pelo grupo em 9 out. 2026.</w:t>
+        <w:t>REGISTRO de medidas do trabalho 03 de Física Geral Experimental I. Uberlândia, 6 out. 2026. Planilha medidas_fisicaEX03.xlsx, duas fotografias das anotações e cinco fotografias da montagem. Medidas conferidas pelo grupo em 9 out. 2026; imagens da montagem fornecidas em 12 out. 2026.</w:t>
       </w:r>
     </w:p>
     <w:p>
@@ -9836,6 +9926,217 @@
       </w:r>
       <w:r>
         <w:t>Material de aula sobre propagação de incertezas, linearização e regressão linear.</w:t>
+      </w:r>
+    </w:p>
+    <w:p>
+      <w:pPr>
+        <w:pStyle w:val="Heading1"/>
+        <w:keepNext/>
+      </w:pPr>
+      <w:r>
+        <w:t>APÊNDICE A – REGISTRO FOTOGRÁFICO DA MONTAGEM</w:t>
+      </w:r>
+    </w:p>
+    <w:p>
+      <w:pPr>
+        <w:spacing w:after="160"/>
+      </w:pPr>
+      <w:r>
+        <w:t>As imagens fornecidas pelo grupo registram o arranjo observado. Foram selecionadas três vistas complementares: o conjunto completo, a região de queda da esfera e a unidade de cronometragem.</w:t>
+      </w:r>
+    </w:p>
+    <w:p>
+      <w:pPr>
+        <w:keepNext/>
+        <w:spacing w:before="120" w:after="100"/>
+      </w:pPr>
+      <w:r>
+        <w:rPr>
+          <w:sz w:val="20"/>
+        </w:rPr>
+        <w:t>Figura 6 – Visão geral da montagem experimental</w:t>
+      </w:r>
+    </w:p>
+    <w:p>
+      <w:pPr>
+        <w:spacing w:after="80"/>
+        <w:jc w:val="center"/>
+      </w:pPr>
+      <w:r>
+        <w:drawing>
+          <wp:inline xmlns:a="http://schemas.openxmlformats.org/drawingml/2006/main" xmlns:pic="http://schemas.openxmlformats.org/drawingml/2006/picture">
+            <wp:extent cx="3311999" cy="5887998"/>
+            <wp:docPr id="6" name="Picture 6"/>
+            <wp:cNvGraphicFramePr>
+              <a:graphicFrameLocks noChangeAspect="1"/>
+            </wp:cNvGraphicFramePr>
+            <a:graphic>
+              <a:graphicData uri="http://schemas.openxmlformats.org/drawingml/2006/picture">
+                <pic:pic>
+                  <pic:nvPicPr>
+                    <pic:cNvPr id="0" name="montagem_01.jpeg"/>
+                    <pic:cNvPicPr/>
+                  </pic:nvPicPr>
+                  <pic:blipFill>
+                    <a:blip r:embed="rId21"/>
+                    <a:stretch>
+                      <a:fillRect/>
+                    </a:stretch>
+                  </pic:blipFill>
+                  <pic:spPr>
+                    <a:xfrm>
+                      <a:off x="0" y="0"/>
+                      <a:ext cx="3311999" cy="5887998"/>
+                    </a:xfrm>
+                    <a:prstGeom prst="rect"/>
+                  </pic:spPr>
+                </pic:pic>
+              </a:graphicData>
+            </a:graphic>
+          </wp:inline>
+        </w:drawing>
+      </w:r>
+    </w:p>
+    <w:p>
+      <w:pPr>
+        <w:spacing w:after="60"/>
+      </w:pPr>
+      <w:r>
+        <w:rPr>
+          <w:sz w:val="18"/>
+        </w:rPr>
+        <w:t>Fonte: registro fotográfico fornecido pelo grupo.</w:t>
+      </w:r>
+    </w:p>
+    <w:p>
+      <w:r>
+        <w:br w:type="page"/>
+      </w:r>
+    </w:p>
+    <w:p>
+      <w:pPr>
+        <w:keepNext/>
+        <w:spacing w:before="120" w:after="100"/>
+      </w:pPr>
+      <w:r>
+        <w:rPr>
+          <w:sz w:val="20"/>
+        </w:rPr>
+        <w:t>Figura 7 – Esfera, suporte e plataforma de parada</w:t>
+      </w:r>
+    </w:p>
+    <w:p>
+      <w:pPr>
+        <w:spacing w:after="80"/>
+        <w:jc w:val="center"/>
+      </w:pPr>
+      <w:r>
+        <w:drawing>
+          <wp:inline xmlns:a="http://schemas.openxmlformats.org/drawingml/2006/main" xmlns:pic="http://schemas.openxmlformats.org/drawingml/2006/picture">
+            <wp:extent cx="2052000" cy="3648000"/>
+            <wp:docPr id="7" name="Picture 7"/>
+            <wp:cNvGraphicFramePr>
+              <a:graphicFrameLocks noChangeAspect="1"/>
+            </wp:cNvGraphicFramePr>
+            <a:graphic>
+              <a:graphicData uri="http://schemas.openxmlformats.org/drawingml/2006/picture">
+                <pic:pic>
+                  <pic:nvPicPr>
+                    <pic:cNvPr id="0" name="montagem_04.jpeg"/>
+                    <pic:cNvPicPr/>
+                  </pic:nvPicPr>
+                  <pic:blipFill>
+                    <a:blip r:embed="rId22"/>
+                    <a:stretch>
+                      <a:fillRect/>
+                    </a:stretch>
+                  </pic:blipFill>
+                  <pic:spPr>
+                    <a:xfrm>
+                      <a:off x="0" y="0"/>
+                      <a:ext cx="2052000" cy="3648000"/>
+                    </a:xfrm>
+                    <a:prstGeom prst="rect"/>
+                  </pic:spPr>
+                </pic:pic>
+              </a:graphicData>
+            </a:graphic>
+          </wp:inline>
+        </w:drawing>
+      </w:r>
+    </w:p>
+    <w:p>
+      <w:pPr>
+        <w:spacing w:after="60"/>
+      </w:pPr>
+      <w:r>
+        <w:rPr>
+          <w:sz w:val="18"/>
+        </w:rPr>
+        <w:t>Fonte: registro fotográfico fornecido pelo grupo.</w:t>
+      </w:r>
+    </w:p>
+    <w:p>
+      <w:pPr>
+        <w:keepNext/>
+        <w:spacing w:before="120" w:after="100"/>
+      </w:pPr>
+      <w:r>
+        <w:rPr>
+          <w:sz w:val="20"/>
+        </w:rPr>
+        <w:t>Figura 8 – Unidade de cronometragem</w:t>
+      </w:r>
+    </w:p>
+    <w:p>
+      <w:pPr>
+        <w:spacing w:after="80"/>
+        <w:jc w:val="center"/>
+      </w:pPr>
+      <w:r>
+        <w:drawing>
+          <wp:inline xmlns:a="http://schemas.openxmlformats.org/drawingml/2006/main" xmlns:pic="http://schemas.openxmlformats.org/drawingml/2006/picture">
+            <wp:extent cx="2052000" cy="3648000"/>
+            <wp:docPr id="8" name="Picture 8"/>
+            <wp:cNvGraphicFramePr>
+              <a:graphicFrameLocks noChangeAspect="1"/>
+            </wp:cNvGraphicFramePr>
+            <a:graphic>
+              <a:graphicData uri="http://schemas.openxmlformats.org/drawingml/2006/picture">
+                <pic:pic>
+                  <pic:nvPicPr>
+                    <pic:cNvPr id="0" name="montagem_02.jpeg"/>
+                    <pic:cNvPicPr/>
+                  </pic:nvPicPr>
+                  <pic:blipFill>
+                    <a:blip r:embed="rId23"/>
+                    <a:stretch>
+                      <a:fillRect/>
+                    </a:stretch>
+                  </pic:blipFill>
+                  <pic:spPr>
+                    <a:xfrm>
+                      <a:off x="0" y="0"/>
+                      <a:ext cx="2052000" cy="3648000"/>
+                    </a:xfrm>
+                    <a:prstGeom prst="rect"/>
+                  </pic:spPr>
+                </pic:pic>
+              </a:graphicData>
+            </a:graphic>
+          </wp:inline>
+        </w:drawing>
+      </w:r>
+    </w:p>
+    <w:p>
+      <w:pPr>
+        <w:spacing w:after="60"/>
+      </w:pPr>
+      <w:r>
+        <w:rPr>
+          <w:sz w:val="18"/>
+        </w:rPr>
+        <w:t>Fonte: registro fotográfico fornecido pelo grupo.</w:t>
       </w:r>
     </w:p>
     <w:sectPr>

</xml_diff>

<commit_message>
Move fotos da montagem para metodologia do EX03
</commit_message>
<xml_diff>
--- a/FisicaEx03/Relatorio_Final.docx
+++ b/FisicaEx03/Relatorio_Final.docx
@@ -5,6 +5,7 @@
     <w:p>
       <w:pPr>
         <w:pStyle w:val="Ttulodotrabalho"/>
+        <w:ind w:firstLine="708"/>
       </w:pPr>
       <w:r>
         <w:rPr>
@@ -276,7 +277,29 @@
         <w:rPr>
           <w:sz w:val="20"/>
         </w:rPr>
-        <w:t>Figura 1 – Altura em função do tempo médio</w:t>
+        <w:t>Figura 1 – Visão geral da montagem experimental</w:t>
+      </w:r>
+      <w:r>
+        <w:rPr>
+          <w:sz w:val="20"/>
+        </w:rPr>
+        <w:tab/>
+        <w:t>8</w:t>
+      </w:r>
+    </w:p>
+    <w:p>
+      <w:pPr>
+        <w:tabs>
+          <w:tab w:val="right" w:leader="dot" w:pos="8504"/>
+        </w:tabs>
+        <w:spacing w:line="240" w:lineRule="auto"/>
+        <w:ind w:firstLine="0"/>
+      </w:pPr>
+      <w:r>
+        <w:rPr>
+          <w:sz w:val="20"/>
+        </w:rPr>
+        <w:t>Figura 2 – Esfera, suporte e plataforma de parada</w:t>
       </w:r>
       <w:r>
         <w:rPr>
@@ -298,7 +321,170 @@
         <w:rPr>
           <w:sz w:val="20"/>
         </w:rPr>
-        <w:t>Figura 2 – Linearização logarítmica e reta ajustada</w:t>
+        <w:t>Figura 3 – Unidade de cronometragem</w:t>
+      </w:r>
+      <w:r>
+        <w:rPr>
+          <w:sz w:val="20"/>
+        </w:rPr>
+        <w:tab/>
+        <w:t>9</w:t>
+      </w:r>
+    </w:p>
+    <w:p>
+      <w:pPr>
+        <w:tabs>
+          <w:tab w:val="right" w:leader="dot" w:pos="8504"/>
+        </w:tabs>
+        <w:spacing w:line="240" w:lineRule="auto"/>
+        <w:ind w:firstLine="0"/>
+      </w:pPr>
+      <w:r>
+        <w:rPr>
+          <w:sz w:val="20"/>
+        </w:rPr>
+        <w:t>Figura 4 – Altura em função do tempo médio</w:t>
+      </w:r>
+      <w:r>
+        <w:rPr>
+          <w:sz w:val="20"/>
+        </w:rPr>
+        <w:tab/>
+        <w:t>11</w:t>
+      </w:r>
+    </w:p>
+    <w:p>
+      <w:pPr>
+        <w:tabs>
+          <w:tab w:val="right" w:leader="dot" w:pos="8504"/>
+        </w:tabs>
+        <w:spacing w:line="240" w:lineRule="auto"/>
+        <w:ind w:firstLine="0"/>
+      </w:pPr>
+      <w:r>
+        <w:rPr>
+          <w:sz w:val="20"/>
+        </w:rPr>
+        <w:t>Figura 5 – Linearização logarítmica e reta ajustada</w:t>
+      </w:r>
+      <w:r>
+        <w:rPr>
+          <w:sz w:val="20"/>
+        </w:rPr>
+        <w:tab/>
+        <w:t>12</w:t>
+      </w:r>
+    </w:p>
+    <w:p>
+      <w:pPr>
+        <w:tabs>
+          <w:tab w:val="right" w:leader="dot" w:pos="8504"/>
+        </w:tabs>
+        <w:spacing w:line="240" w:lineRule="auto"/>
+        <w:ind w:firstLine="0"/>
+      </w:pPr>
+      <w:r>
+        <w:rPr>
+          <w:sz w:val="20"/>
+        </w:rPr>
+        <w:t>Figura 6 – Lei de potência na escala original</w:t>
+      </w:r>
+      <w:r>
+        <w:rPr>
+          <w:sz w:val="20"/>
+        </w:rPr>
+        <w:tab/>
+        <w:t>13</w:t>
+      </w:r>
+    </w:p>
+    <w:p>
+      <w:pPr>
+        <w:tabs>
+          <w:tab w:val="right" w:leader="dot" w:pos="8504"/>
+        </w:tabs>
+        <w:spacing w:line="240" w:lineRule="auto"/>
+        <w:ind w:firstLine="0"/>
+      </w:pPr>
+      <w:r>
+        <w:rPr>
+          <w:sz w:val="20"/>
+        </w:rPr>
+        <w:t>Figura 7 – Altura em função do tempo ao quadrado</w:t>
+      </w:r>
+      <w:r>
+        <w:rPr>
+          <w:sz w:val="20"/>
+        </w:rPr>
+        <w:tab/>
+        <w:t>14</w:t>
+      </w:r>
+    </w:p>
+    <w:p>
+      <w:pPr>
+        <w:tabs>
+          <w:tab w:val="right" w:leader="dot" w:pos="8504"/>
+        </w:tabs>
+        <w:spacing w:line="240" w:lineRule="auto"/>
+        <w:ind w:firstLine="0"/>
+      </w:pPr>
+      <w:r>
+        <w:rPr>
+          <w:sz w:val="20"/>
+        </w:rPr>
+        <w:t>Figura 8 – Tempo ao quadrado em função da altura</w:t>
+      </w:r>
+      <w:r>
+        <w:rPr>
+          <w:sz w:val="20"/>
+        </w:rPr>
+        <w:tab/>
+        <w:t>15</w:t>
+      </w:r>
+    </w:p>
+    <w:p>
+      <w:pPr>
+        <w:pStyle w:val="Resumo"/>
+        <w:spacing w:before="480" w:after="320"/>
+      </w:pPr>
+      <w:r>
+        <w:t>LISTA DE TABELAS</w:t>
+      </w:r>
+    </w:p>
+    <w:p>
+      <w:pPr>
+        <w:tabs>
+          <w:tab w:val="right" w:leader="dot" w:pos="8504"/>
+        </w:tabs>
+        <w:spacing w:line="240" w:lineRule="auto"/>
+        <w:ind w:firstLine="0"/>
+      </w:pPr>
+      <w:r>
+        <w:rPr>
+          <w:sz w:val="20"/>
+        </w:rPr>
+        <w:t>Tabela 1 – Medidas originais de altura e tempo</w:t>
+      </w:r>
+      <w:r>
+        <w:rPr>
+          <w:sz w:val="20"/>
+        </w:rPr>
+        <w:tab/>
+        <w:t>7</w:t>
+      </w:r>
+    </w:p>
+    <w:p>
+      <w:pPr>
+        <w:tabs>
+          <w:tab w:val="right" w:leader="dot" w:pos="8504"/>
+        </w:tabs>
+        <w:spacing w:line="240" w:lineRule="auto"/>
+        <w:ind w:firstLine="0"/>
+      </w:pPr>
+      <w:r>
+        <w:rPr>
+          <w:sz w:val="20"/>
+        </w:rPr>
+        <w:t>Tabela 2 – Tempos médios e incertezas</w:t>
       </w:r>
       <w:r>
         <w:rPr>
@@ -320,14 +506,14 @@
         <w:rPr>
           <w:sz w:val="20"/>
         </w:rPr>
-        <w:t>Figura 3 – Lei de potência na escala original</w:t>
+        <w:t>Tabela 3 – Variáveis logarítmicas</w:t>
       </w:r>
       <w:r>
         <w:rPr>
           <w:sz w:val="20"/>
         </w:rPr>
         <w:tab/>
-        <w:t>11</w:t>
+        <w:t>12</w:t>
       </w:r>
     </w:p>
     <w:p>
@@ -342,14 +528,14 @@
         <w:rPr>
           <w:sz w:val="20"/>
         </w:rPr>
-        <w:t>Figura 4 – Altura em função do tempo ao quadrado</w:t>
+        <w:t>Tabela 4 – Tempo ao quadrado e incerteza</w:t>
       </w:r>
       <w:r>
         <w:rPr>
           <w:sz w:val="20"/>
         </w:rPr>
         <w:tab/>
-        <w:t>12</w:t>
+        <w:t>14</w:t>
       </w:r>
     </w:p>
     <w:p>
@@ -364,199 +550,14 @@
         <w:rPr>
           <w:sz w:val="20"/>
         </w:rPr>
-        <w:t>Figura 5 – Tempo ao quadrado em função da altura</w:t>
+        <w:t>Tabela 5 – Parâmetros dos ajustes</w:t>
       </w:r>
       <w:r>
         <w:rPr>
           <w:sz w:val="20"/>
         </w:rPr>
         <w:tab/>
-        <w:t>13</w:t>
-      </w:r>
-    </w:p>
-    <w:p>
-      <w:pPr>
-        <w:tabs>
-          <w:tab w:val="right" w:leader="dot" w:pos="8504"/>
-        </w:tabs>
-        <w:spacing w:line="240" w:lineRule="auto"/>
-        <w:ind w:firstLine="0"/>
-      </w:pPr>
-      <w:r>
-        <w:rPr>
-          <w:sz w:val="20"/>
-        </w:rPr>
-        <w:t>Figura 6 – Visão geral da montagem experimental</w:t>
-      </w:r>
-      <w:r>
-        <w:rPr>
-          <w:sz w:val="20"/>
-        </w:rPr>
-        <w:tab/>
-        <w:t>17</w:t>
-      </w:r>
-    </w:p>
-    <w:p>
-      <w:pPr>
-        <w:tabs>
-          <w:tab w:val="right" w:leader="dot" w:pos="8504"/>
-        </w:tabs>
-        <w:spacing w:line="240" w:lineRule="auto"/>
-        <w:ind w:firstLine="0"/>
-      </w:pPr>
-      <w:r>
-        <w:rPr>
-          <w:sz w:val="20"/>
-        </w:rPr>
-        <w:t>Figura 7 – Esfera, suporte e plataforma de parada</w:t>
-      </w:r>
-      <w:r>
-        <w:rPr>
-          <w:sz w:val="20"/>
-        </w:rPr>
-        <w:tab/>
-        <w:t>18</w:t>
-      </w:r>
-    </w:p>
-    <w:p>
-      <w:pPr>
-        <w:tabs>
-          <w:tab w:val="right" w:leader="dot" w:pos="8504"/>
-        </w:tabs>
-        <w:spacing w:line="240" w:lineRule="auto"/>
-        <w:ind w:firstLine="0"/>
-      </w:pPr>
-      <w:r>
-        <w:rPr>
-          <w:sz w:val="20"/>
-        </w:rPr>
-        <w:t>Figura 8 – Unidade de cronometragem</w:t>
-      </w:r>
-      <w:r>
-        <w:rPr>
-          <w:sz w:val="20"/>
-        </w:rPr>
-        <w:tab/>
-        <w:t>18</w:t>
-      </w:r>
-    </w:p>
-    <w:p>
-      <w:pPr>
-        <w:pStyle w:val="Resumo"/>
-        <w:spacing w:before="480" w:after="320"/>
-      </w:pPr>
-      <w:r>
-        <w:t>LISTA DE TABELAS</w:t>
-      </w:r>
-    </w:p>
-    <w:p>
-      <w:pPr>
-        <w:tabs>
-          <w:tab w:val="right" w:leader="dot" w:pos="8504"/>
-        </w:tabs>
-        <w:spacing w:line="240" w:lineRule="auto"/>
-        <w:ind w:firstLine="0"/>
-      </w:pPr>
-      <w:r>
-        <w:rPr>
-          <w:sz w:val="20"/>
-        </w:rPr>
-        <w:t>Tabela 1 – Medidas originais de altura e tempo</w:t>
-      </w:r>
-      <w:r>
-        <w:rPr>
-          <w:sz w:val="20"/>
-        </w:rPr>
-        <w:tab/>
-        <w:t>7</w:t>
-      </w:r>
-    </w:p>
-    <w:p>
-      <w:pPr>
-        <w:tabs>
-          <w:tab w:val="right" w:leader="dot" w:pos="8504"/>
-        </w:tabs>
-        <w:spacing w:line="240" w:lineRule="auto"/>
-        <w:ind w:firstLine="0"/>
-      </w:pPr>
-      <w:r>
-        <w:rPr>
-          <w:sz w:val="20"/>
-        </w:rPr>
-        <w:t>Tabela 2 – Tempos médios e incertezas</w:t>
-      </w:r>
-      <w:r>
-        <w:rPr>
-          <w:sz w:val="20"/>
-        </w:rPr>
-        <w:tab/>
-        <w:t>8</w:t>
-      </w:r>
-    </w:p>
-    <w:p>
-      <w:pPr>
-        <w:tabs>
-          <w:tab w:val="right" w:leader="dot" w:pos="8504"/>
-        </w:tabs>
-        <w:spacing w:line="240" w:lineRule="auto"/>
-        <w:ind w:firstLine="0"/>
-      </w:pPr>
-      <w:r>
-        <w:rPr>
-          <w:sz w:val="20"/>
-        </w:rPr>
-        <w:t>Tabela 3 – Variáveis logarítmicas</w:t>
-      </w:r>
-      <w:r>
-        <w:rPr>
-          <w:sz w:val="20"/>
-        </w:rPr>
-        <w:tab/>
-        <w:t>10</w:t>
-      </w:r>
-    </w:p>
-    <w:p>
-      <w:pPr>
-        <w:tabs>
-          <w:tab w:val="right" w:leader="dot" w:pos="8504"/>
-        </w:tabs>
-        <w:spacing w:line="240" w:lineRule="auto"/>
-        <w:ind w:firstLine="0"/>
-      </w:pPr>
-      <w:r>
-        <w:rPr>
-          <w:sz w:val="20"/>
-        </w:rPr>
-        <w:t>Tabela 4 – Tempo ao quadrado e incerteza</w:t>
-      </w:r>
-      <w:r>
-        <w:rPr>
-          <w:sz w:val="20"/>
-        </w:rPr>
-        <w:tab/>
-        <w:t>12</w:t>
-      </w:r>
-    </w:p>
-    <w:p>
-      <w:pPr>
-        <w:tabs>
-          <w:tab w:val="right" w:leader="dot" w:pos="8504"/>
-        </w:tabs>
-        <w:spacing w:line="240" w:lineRule="auto"/>
-        <w:ind w:firstLine="0"/>
-      </w:pPr>
-      <w:r>
-        <w:rPr>
-          <w:sz w:val="20"/>
-        </w:rPr>
-        <w:t>Tabela 5 – Parâmetros dos ajustes</w:t>
-      </w:r>
-      <w:r>
-        <w:rPr>
-          <w:sz w:val="20"/>
-        </w:rPr>
-        <w:tab/>
-        <w:t>13</w:t>
+        <w:t>15</w:t>
       </w:r>
     </w:p>
     <w:p>
@@ -722,6 +723,28 @@
       </w:pPr>
       <w:r>
         <w:rPr>
+          <w:sz w:val="20"/>
+        </w:rPr>
+        <w:t>3.1 Registro fotográfico da montagem</w:t>
+      </w:r>
+      <w:r>
+        <w:rPr>
+          <w:sz w:val="20"/>
+        </w:rPr>
+        <w:tab/>
+        <w:t>8</w:t>
+      </w:r>
+    </w:p>
+    <w:p>
+      <w:pPr>
+        <w:tabs>
+          <w:tab w:val="right" w:leader="dot" w:pos="8504"/>
+        </w:tabs>
+        <w:spacing w:line="240" w:lineRule="auto"/>
+        <w:ind w:firstLine="0"/>
+      </w:pPr>
+      <w:r>
+        <w:rPr>
           <w:b/>
           <w:sz w:val="20"/>
         </w:rPr>
@@ -733,7 +756,7 @@
           <w:sz w:val="20"/>
         </w:rPr>
         <w:tab/>
-        <w:t>8</w:t>
+        <w:t>10</w:t>
       </w:r>
     </w:p>
     <w:p>
@@ -755,7 +778,7 @@
           <w:sz w:val="20"/>
         </w:rPr>
         <w:tab/>
-        <w:t>8</w:t>
+        <w:t>10</w:t>
       </w:r>
     </w:p>
     <w:p>
@@ -777,7 +800,7 @@
           <w:sz w:val="20"/>
         </w:rPr>
         <w:tab/>
-        <w:t>10</w:t>
+        <w:t>12</w:t>
       </w:r>
     </w:p>
     <w:p>
@@ -799,7 +822,7 @@
           <w:sz w:val="20"/>
         </w:rPr>
         <w:tab/>
-        <w:t>12</w:t>
+        <w:t>14</w:t>
       </w:r>
     </w:p>
     <w:p>
@@ -821,7 +844,7 @@
           <w:sz w:val="20"/>
         </w:rPr>
         <w:tab/>
-        <w:t>14</w:t>
+        <w:t>16</w:t>
       </w:r>
     </w:p>
     <w:p>
@@ -838,54 +861,6 @@
           <w:sz w:val="20"/>
         </w:rPr>
         <w:t>5 CONCLUSÃO</w:t>
-      </w:r>
-      <w:r>
-        <w:rPr>
-          <w:b/>
-          <w:sz w:val="20"/>
-        </w:rPr>
-        <w:tab/>
-        <w:t>15</w:t>
-      </w:r>
-    </w:p>
-    <w:p>
-      <w:pPr>
-        <w:tabs>
-          <w:tab w:val="right" w:leader="dot" w:pos="8504"/>
-        </w:tabs>
-        <w:spacing w:line="240" w:lineRule="auto"/>
-        <w:ind w:firstLine="0"/>
-      </w:pPr>
-      <w:r>
-        <w:rPr>
-          <w:b/>
-          <w:sz w:val="20"/>
-        </w:rPr>
-        <w:t>REFERÊNCIAS</w:t>
-      </w:r>
-      <w:r>
-        <w:rPr>
-          <w:b/>
-          <w:sz w:val="20"/>
-        </w:rPr>
-        <w:tab/>
-        <w:t>16</w:t>
-      </w:r>
-    </w:p>
-    <w:p>
-      <w:pPr>
-        <w:tabs>
-          <w:tab w:val="right" w:leader="dot" w:pos="8504"/>
-        </w:tabs>
-        <w:spacing w:line="240" w:lineRule="auto"/>
-        <w:ind w:firstLine="0"/>
-      </w:pPr>
-      <w:r>
-        <w:rPr>
-          <w:b/>
-          <w:sz w:val="20"/>
-        </w:rPr>
-        <w:t>APÊNDICE A – REGISTRO FOTOGRÁFICO DA MONTAGEM</w:t>
       </w:r>
       <w:r>
         <w:rPr>
@@ -894,6 +869,30 @@
         </w:rPr>
         <w:tab/>
         <w:t>17</w:t>
+      </w:r>
+    </w:p>
+    <w:p>
+      <w:pPr>
+        <w:tabs>
+          <w:tab w:val="right" w:leader="dot" w:pos="8504"/>
+        </w:tabs>
+        <w:spacing w:line="240" w:lineRule="auto"/>
+        <w:ind w:firstLine="0"/>
+      </w:pPr>
+      <w:r>
+        <w:rPr>
+          <w:b/>
+          <w:sz w:val="20"/>
+        </w:rPr>
+        <w:t>REFERÊNCIAS</w:t>
+      </w:r>
+      <w:r>
+        <w:rPr>
+          <w:b/>
+          <w:sz w:val="20"/>
+        </w:rPr>
+        <w:tab/>
+        <w:t>18</w:t>
       </w:r>
     </w:p>
     <w:p>
@@ -1063,7 +1062,97 @@
           <w:sz w:val="22"/>
           <w:lang w:val="en-US"/>
         </w:rPr>
-        <w:t>X = ln(d/1 m);  Y = ln(t̄/1 s);  Y = aX + b</w:t>
+        <w:t xml:space="preserve">X = </w:t>
+      </w:r>
+      <w:proofErr w:type="gramStart"/>
+      <w:r>
+        <w:rPr>
+          <w:rFonts w:ascii="Cambria Math" w:hAnsi="Cambria Math"/>
+          <w:sz w:val="22"/>
+          <w:lang w:val="en-US"/>
+        </w:rPr>
+        <w:t>ln(</w:t>
+      </w:r>
+      <w:proofErr w:type="gramEnd"/>
+      <w:r>
+        <w:rPr>
+          <w:rFonts w:ascii="Cambria Math" w:hAnsi="Cambria Math"/>
+          <w:sz w:val="22"/>
+          <w:lang w:val="en-US"/>
+        </w:rPr>
+        <w:t>d/1 m</w:t>
+      </w:r>
+      <w:proofErr w:type="gramStart"/>
+      <w:r>
+        <w:rPr>
+          <w:rFonts w:ascii="Cambria Math" w:hAnsi="Cambria Math"/>
+          <w:sz w:val="22"/>
+          <w:lang w:val="en-US"/>
+        </w:rPr>
+        <w:t>);  Y</w:t>
+      </w:r>
+      <w:proofErr w:type="gramEnd"/>
+      <w:r>
+        <w:rPr>
+          <w:rFonts w:ascii="Cambria Math" w:hAnsi="Cambria Math"/>
+          <w:sz w:val="22"/>
+          <w:lang w:val="en-US"/>
+        </w:rPr>
+        <w:t xml:space="preserve"> = </w:t>
+      </w:r>
+      <w:proofErr w:type="gramStart"/>
+      <w:r>
+        <w:rPr>
+          <w:rFonts w:ascii="Cambria Math" w:hAnsi="Cambria Math"/>
+          <w:sz w:val="22"/>
+          <w:lang w:val="en-US"/>
+        </w:rPr>
+        <w:t>ln(</w:t>
+      </w:r>
+      <w:proofErr w:type="gramEnd"/>
+      <w:r>
+        <w:rPr>
+          <w:rFonts w:ascii="Cambria Math" w:hAnsi="Cambria Math"/>
+          <w:sz w:val="22"/>
+          <w:lang w:val="en-US"/>
+        </w:rPr>
+        <w:t>t̄/1 s</w:t>
+      </w:r>
+      <w:proofErr w:type="gramStart"/>
+      <w:r>
+        <w:rPr>
+          <w:rFonts w:ascii="Cambria Math" w:hAnsi="Cambria Math"/>
+          <w:sz w:val="22"/>
+          <w:lang w:val="en-US"/>
+        </w:rPr>
+        <w:t>);  Y</w:t>
+      </w:r>
+      <w:proofErr w:type="gramEnd"/>
+      <w:r>
+        <w:rPr>
+          <w:rFonts w:ascii="Cambria Math" w:hAnsi="Cambria Math"/>
+          <w:sz w:val="22"/>
+          <w:lang w:val="en-US"/>
+        </w:rPr>
+        <w:t xml:space="preserve"> = </w:t>
+      </w:r>
+      <w:proofErr w:type="spellStart"/>
+      <w:r>
+        <w:rPr>
+          <w:rFonts w:ascii="Cambria Math" w:hAnsi="Cambria Math"/>
+          <w:sz w:val="22"/>
+          <w:lang w:val="en-US"/>
+        </w:rPr>
+        <w:t>aX</w:t>
+      </w:r>
+      <w:proofErr w:type="spellEnd"/>
+      <w:r>
+        <w:rPr>
+          <w:rFonts w:ascii="Cambria Math" w:hAnsi="Cambria Math"/>
+          <w:sz w:val="22"/>
+          <w:lang w:val="en-US"/>
+        </w:rPr>
+        <w:t xml:space="preserve"> + b</w:t>
       </w:r>
       <w:r>
         <w:rPr>
@@ -1154,7 +1243,7 @@
     </w:p>
     <w:p>
       <w:r>
-        <w:t>O roteiro do capítulo 12 descreve uma esfera metálica mantida por disparador eletromagnético, uma haste graduada, um cronômetro e uma plataforma de parada. A soltura inicia a contagem, encerrada no impacto. As fotografias fornecidas pelo grupo documentam a montagem utilizada e são apresentadas no Apêndice A. Elas mostram a haste, o suporte da esfera, a base e a unidade de cronometragem, sem permitir concluir ajustes ou calibração que não foram registrados.</w:t>
+        <w:t>O roteiro do capítulo 12 descreve uma esfera metálica mantida por disparador eletromagnético, uma haste graduada, um cronômetro e uma plataforma de parada. A soltura inicia a contagem, encerrada no impacto. As fotografias fornecidas pelo grupo documentam a montagem utilizada e são apresentadas na Seção 3.1. Elas mostram a haste, o suporte da esfera, a base e a unidade de cronometragem, sem permitir concluir ajustes ou calibração que não foram registrados.</w:t>
       </w:r>
     </w:p>
     <w:p>
@@ -3563,6 +3652,236 @@
     </w:p>
     <w:p>
       <w:pPr>
+        <w:pStyle w:val="Heading2"/>
+        <w:keepNext/>
+        <w:pageBreakBefore/>
+      </w:pPr>
+      <w:r>
+        <w:t>3.1 Registro fotográfico da montagem</w:t>
+      </w:r>
+    </w:p>
+    <w:p>
+      <w:pPr>
+        <w:spacing w:after="160"/>
+      </w:pPr>
+      <w:r>
+        <w:t>As imagens fornecidas pelo grupo registram o arranjo observado. Foram selecionadas três vistas complementares: o conjunto completo, a região de queda da esfera e a unidade de cronometragem.</w:t>
+      </w:r>
+    </w:p>
+    <w:p>
+      <w:pPr>
+        <w:keepNext/>
+        <w:spacing w:before="120" w:after="100"/>
+      </w:pPr>
+      <w:r>
+        <w:rPr>
+          <w:sz w:val="20"/>
+        </w:rPr>
+        <w:t>Figura 1 – Visão geral da montagem experimental</w:t>
+      </w:r>
+    </w:p>
+    <w:p>
+      <w:pPr>
+        <w:spacing w:after="80"/>
+        <w:jc w:val="center"/>
+      </w:pPr>
+      <w:r>
+        <w:rPr>
+          <w:noProof/>
+        </w:rPr>
+        <w:drawing>
+          <wp:inline distT="0" distB="0" distL="0" distR="0" wp14:anchorId="2F45705B" wp14:editId="15F4118D">
+            <wp:extent cx="3311999" cy="5887998"/>
+            <wp:effectExtent l="0" t="0" r="0" b="0"/>
+            <wp:docPr id="6" name="Picture 6"/>
+            <wp:cNvGraphicFramePr>
+              <a:graphicFrameLocks xmlns:a="http://schemas.openxmlformats.org/drawingml/2006/main" noChangeAspect="1"/>
+            </wp:cNvGraphicFramePr>
+            <a:graphic xmlns:a="http://schemas.openxmlformats.org/drawingml/2006/main">
+              <a:graphicData uri="http://schemas.openxmlformats.org/drawingml/2006/picture">
+                <pic:pic xmlns:pic="http://schemas.openxmlformats.org/drawingml/2006/picture">
+                  <pic:nvPicPr>
+                    <pic:cNvPr id="0" name="montagem_01.jpeg"/>
+                    <pic:cNvPicPr/>
+                  </pic:nvPicPr>
+                  <pic:blipFill>
+                    <a:blip r:embed="rId17"/>
+                    <a:stretch>
+                      <a:fillRect/>
+                    </a:stretch>
+                  </pic:blipFill>
+                  <pic:spPr>
+                    <a:xfrm>
+                      <a:off x="0" y="0"/>
+                      <a:ext cx="3311999" cy="5887998"/>
+                    </a:xfrm>
+                    <a:prstGeom prst="rect">
+                      <a:avLst/>
+                    </a:prstGeom>
+                  </pic:spPr>
+                </pic:pic>
+              </a:graphicData>
+            </a:graphic>
+          </wp:inline>
+        </w:drawing>
+      </w:r>
+    </w:p>
+    <w:p>
+      <w:pPr>
+        <w:spacing w:after="60"/>
+      </w:pPr>
+      <w:r>
+        <w:rPr>
+          <w:sz w:val="18"/>
+        </w:rPr>
+        <w:t>Fonte: registro fotográfico fornecido pelo grupo.</w:t>
+      </w:r>
+    </w:p>
+    <w:p>
+      <w:r>
+        <w:br w:type="page"/>
+      </w:r>
+    </w:p>
+    <w:p>
+      <w:pPr>
+        <w:keepNext/>
+        <w:spacing w:before="120" w:after="100"/>
+      </w:pPr>
+      <w:r>
+        <w:rPr>
+          <w:sz w:val="20"/>
+        </w:rPr>
+        <w:t>Figura 2 – Esfera, suporte e plataforma de parada</w:t>
+      </w:r>
+    </w:p>
+    <w:p>
+      <w:pPr>
+        <w:spacing w:after="80"/>
+        <w:jc w:val="center"/>
+      </w:pPr>
+      <w:r>
+        <w:rPr>
+          <w:noProof/>
+        </w:rPr>
+        <w:drawing>
+          <wp:inline distT="0" distB="0" distL="0" distR="0" wp14:anchorId="4F52146E" wp14:editId="1AE6A15F">
+            <wp:extent cx="2052000" cy="3648000"/>
+            <wp:effectExtent l="0" t="0" r="0" b="0"/>
+            <wp:docPr id="7" name="Picture 7"/>
+            <wp:cNvGraphicFramePr>
+              <a:graphicFrameLocks xmlns:a="http://schemas.openxmlformats.org/drawingml/2006/main" noChangeAspect="1"/>
+            </wp:cNvGraphicFramePr>
+            <a:graphic xmlns:a="http://schemas.openxmlformats.org/drawingml/2006/main">
+              <a:graphicData uri="http://schemas.openxmlformats.org/drawingml/2006/picture">
+                <pic:pic xmlns:pic="http://schemas.openxmlformats.org/drawingml/2006/picture">
+                  <pic:nvPicPr>
+                    <pic:cNvPr id="0" name="montagem_04.jpeg"/>
+                    <pic:cNvPicPr/>
+                  </pic:nvPicPr>
+                  <pic:blipFill>
+                    <a:blip r:embed="rId18"/>
+                    <a:stretch>
+                      <a:fillRect/>
+                    </a:stretch>
+                  </pic:blipFill>
+                  <pic:spPr>
+                    <a:xfrm>
+                      <a:off x="0" y="0"/>
+                      <a:ext cx="2052000" cy="3648000"/>
+                    </a:xfrm>
+                    <a:prstGeom prst="rect">
+                      <a:avLst/>
+                    </a:prstGeom>
+                  </pic:spPr>
+                </pic:pic>
+              </a:graphicData>
+            </a:graphic>
+          </wp:inline>
+        </w:drawing>
+      </w:r>
+    </w:p>
+    <w:p>
+      <w:pPr>
+        <w:spacing w:after="60"/>
+      </w:pPr>
+      <w:r>
+        <w:rPr>
+          <w:sz w:val="18"/>
+        </w:rPr>
+        <w:t>Fonte: registro fotográfico fornecido pelo grupo.</w:t>
+      </w:r>
+    </w:p>
+    <w:p>
+      <w:pPr>
+        <w:keepNext/>
+        <w:spacing w:before="120" w:after="100"/>
+      </w:pPr>
+      <w:r>
+        <w:rPr>
+          <w:sz w:val="20"/>
+        </w:rPr>
+        <w:t>Figura 3 – Unidade de cronometragem</w:t>
+      </w:r>
+    </w:p>
+    <w:p>
+      <w:pPr>
+        <w:spacing w:after="80"/>
+        <w:jc w:val="center"/>
+      </w:pPr>
+      <w:r>
+        <w:rPr>
+          <w:noProof/>
+        </w:rPr>
+        <w:drawing>
+          <wp:inline distT="0" distB="0" distL="0" distR="0" wp14:anchorId="1CC97216" wp14:editId="772A6EC9">
+            <wp:extent cx="2052000" cy="3648000"/>
+            <wp:effectExtent l="0" t="0" r="0" b="0"/>
+            <wp:docPr id="8" name="Picture 8"/>
+            <wp:cNvGraphicFramePr>
+              <a:graphicFrameLocks xmlns:a="http://schemas.openxmlformats.org/drawingml/2006/main" noChangeAspect="1"/>
+            </wp:cNvGraphicFramePr>
+            <a:graphic xmlns:a="http://schemas.openxmlformats.org/drawingml/2006/main">
+              <a:graphicData uri="http://schemas.openxmlformats.org/drawingml/2006/picture">
+                <pic:pic xmlns:pic="http://schemas.openxmlformats.org/drawingml/2006/picture">
+                  <pic:nvPicPr>
+                    <pic:cNvPr id="0" name="montagem_02.jpeg"/>
+                    <pic:cNvPicPr/>
+                  </pic:nvPicPr>
+                  <pic:blipFill>
+                    <a:blip r:embed="rId19"/>
+                    <a:stretch>
+                      <a:fillRect/>
+                    </a:stretch>
+                  </pic:blipFill>
+                  <pic:spPr>
+                    <a:xfrm>
+                      <a:off x="0" y="0"/>
+                      <a:ext cx="2052000" cy="3648000"/>
+                    </a:xfrm>
+                    <a:prstGeom prst="rect">
+                      <a:avLst/>
+                    </a:prstGeom>
+                  </pic:spPr>
+                </pic:pic>
+              </a:graphicData>
+            </a:graphic>
+          </wp:inline>
+        </w:drawing>
+      </w:r>
+    </w:p>
+    <w:p>
+      <w:pPr>
+        <w:spacing w:after="60"/>
+      </w:pPr>
+      <w:r>
+        <w:rPr>
+          <w:sz w:val="18"/>
+        </w:rPr>
+        <w:t>Fonte: registro fotográfico fornecido pelo grupo.</w:t>
+      </w:r>
+    </w:p>
+    <w:p>
+      <w:pPr>
         <w:pStyle w:val="Heading1"/>
       </w:pPr>
       <w:r>
@@ -5542,8 +5861,7 @@
         <w:rPr>
           <w:sz w:val="20"/>
         </w:rPr>
-        <w:lastRenderedPageBreak/>
-        <w:t>Figura 1 – Altura em função do tempo médio</w:t>
+        <w:t>Figura 4 – Altura em função do tempo médio</w:t>
       </w:r>
     </w:p>
     <w:p>
@@ -5605,7 +5923,7 @@
     </w:p>
     <w:p>
       <w:r>
-        <w:t>A Figura 1 mostra o crescimento da altura percorrida com o tempo médio. A curvatura é compatível qualitativamente com uma dependência superior à linear. As barras de tempo são pequenas na escala da figura, mas seus valores constam da Tabela 2.</w:t>
+        <w:t>A Figura 4 mostra o crescimento da altura percorrida com o tempo médio. A curvatura é compatível qualitativamente com uma dependência superior à linear. As barras de tempo são pequenas na escala da figura, mas seus valores constam da Tabela 2.</w:t>
       </w:r>
     </w:p>
     <w:p>
@@ -7581,7 +7899,7 @@
         <w:rPr>
           <w:sz w:val="20"/>
         </w:rPr>
-        <w:t>Figura 2 – Linearização logarítmica e reta ajustada</w:t>
+        <w:t>Figura 5 – Linearização logarítmica e reta ajustada</w:t>
       </w:r>
     </w:p>
     <w:p>
@@ -7656,8 +7974,7 @@
         <w:rPr>
           <w:sz w:val="20"/>
         </w:rPr>
-        <w:lastRenderedPageBreak/>
-        <w:t>Figura 3 – Lei de potência na escala original</w:t>
+        <w:t>Figura 6 – Lei de potência na escala original</w:t>
       </w:r>
     </w:p>
     <w:p>
@@ -7719,7 +8036,7 @@
     </w:p>
     <w:p>
       <w:r>
-        <w:t>O parâmetro C representa a altura extrapolada para t = 1 s, fora do intervalo de tempos medido. A Figura 3 devolve a lei ajustada à escala original. A curva acompanha a tendência, mas a magnitude dos resíduos requer cautela com as incertezas dos parâmetros.</w:t>
+        <w:t>O parâmetro C representa a altura extrapolada para t = 1 s, fora do intervalo de tempos medido. A Figura 6 devolve a lei ajustada à escala original. A curva acompanha a tendência, mas a magnitude dos resíduos requer cautela com as incertezas dos parâmetros.</w:t>
       </w:r>
     </w:p>
     <w:p>
@@ -9250,7 +9567,7 @@
         <w:rPr>
           <w:sz w:val="20"/>
         </w:rPr>
-        <w:t>Figura 4 – Altura em função do tempo ao quadrado</w:t>
+        <w:t>Figura 7 – Altura em função do tempo ao quadrado</w:t>
       </w:r>
     </w:p>
     <w:p>
@@ -9312,8 +9629,7 @@
     </w:p>
     <w:p>
       <w:r>
-        <w:lastRenderedPageBreak/>
-        <w:t>A Figura 4 apresenta d em função de t̄², conforme o roteiro. A inclinação correspondente à reta pela origem é A = 1/a₀ = 4,7375 m/s² e g = 2A. O valor da inclinação provém do ajuste ponderado de Q em função de d; a figura direta é uma representação dos mesmos pontos e parâmetros, sem uma segunda regressão independente.</w:t>
+        <w:t>A Figura 7 apresenta d em função de t̄², conforme o roteiro. A inclinação correspondente à reta pela origem é A = 1/a₀ = 4,7375 m/s² e g = 2A. O valor da inclinação provém do ajuste ponderado de Q em função de d; a figura direta é uma representação dos mesmos pontos e parâmetros, sem uma segunda regressão independente.</w:t>
       </w:r>
     </w:p>
     <w:p>
@@ -9326,7 +9642,7 @@
         <w:rPr>
           <w:sz w:val="20"/>
         </w:rPr>
-        <w:t>Figura 5 – Tempo ao quadrado em função da altura</w:t>
+        <w:t>Figura 8 – Tempo ao quadrado em função da altura</w:t>
       </w:r>
     </w:p>
     <w:p>
@@ -9388,7 +9704,7 @@
     </w:p>
     <w:p>
       <w:r>
-        <w:t>Como diagnóstico, o modelo Q = ad + b com intercepto livre fornece a = 0,2024629 s²/m e b = (0,00448 ± 0,00006) s². Resulta g = (9,878 ± 0,007) m/s² e qui-quadrado reduzido 3,08, com 15 graus de liberdade. A Figura 5 mostra a orientação usada para ponderar pelas incertezas de Q.</w:t>
+        <w:t>Como diagnóstico, o modelo Q = ad + b com intercepto livre fornece a = 0,2024629 s²/m e b = (0,00448 ± 0,00006) s². Resulta g = (9,878 ± 0,007) m/s² e qui-quadrado reduzido 3,08, com 15 graus de liberdade. A Figura 8 mostra a orientação usada para ponderar pelas incertezas de Q.</w:t>
       </w:r>
     </w:p>
     <w:p>
@@ -9928,220 +10244,9 @@
         <w:t>Material de aula sobre propagação de incertezas, linearização e regressão linear.</w:t>
       </w:r>
     </w:p>
-    <w:p>
-      <w:pPr>
-        <w:pStyle w:val="Heading1"/>
-        <w:keepNext/>
-      </w:pPr>
-      <w:r>
-        <w:t>APÊNDICE A – REGISTRO FOTOGRÁFICO DA MONTAGEM</w:t>
-      </w:r>
-    </w:p>
-    <w:p>
-      <w:pPr>
-        <w:spacing w:after="160"/>
-      </w:pPr>
-      <w:r>
-        <w:t>As imagens fornecidas pelo grupo registram o arranjo observado. Foram selecionadas três vistas complementares: o conjunto completo, a região de queda da esfera e a unidade de cronometragem.</w:t>
-      </w:r>
-    </w:p>
-    <w:p>
-      <w:pPr>
-        <w:keepNext/>
-        <w:spacing w:before="120" w:after="100"/>
-      </w:pPr>
-      <w:r>
-        <w:rPr>
-          <w:sz w:val="20"/>
-        </w:rPr>
-        <w:t>Figura 6 – Visão geral da montagem experimental</w:t>
-      </w:r>
-    </w:p>
-    <w:p>
-      <w:pPr>
-        <w:spacing w:after="80"/>
-        <w:jc w:val="center"/>
-      </w:pPr>
-      <w:r>
-        <w:drawing>
-          <wp:inline xmlns:a="http://schemas.openxmlformats.org/drawingml/2006/main" xmlns:pic="http://schemas.openxmlformats.org/drawingml/2006/picture">
-            <wp:extent cx="3311999" cy="5887998"/>
-            <wp:docPr id="6" name="Picture 6"/>
-            <wp:cNvGraphicFramePr>
-              <a:graphicFrameLocks noChangeAspect="1"/>
-            </wp:cNvGraphicFramePr>
-            <a:graphic>
-              <a:graphicData uri="http://schemas.openxmlformats.org/drawingml/2006/picture">
-                <pic:pic>
-                  <pic:nvPicPr>
-                    <pic:cNvPr id="0" name="montagem_01.jpeg"/>
-                    <pic:cNvPicPr/>
-                  </pic:nvPicPr>
-                  <pic:blipFill>
-                    <a:blip r:embed="rId21"/>
-                    <a:stretch>
-                      <a:fillRect/>
-                    </a:stretch>
-                  </pic:blipFill>
-                  <pic:spPr>
-                    <a:xfrm>
-                      <a:off x="0" y="0"/>
-                      <a:ext cx="3311999" cy="5887998"/>
-                    </a:xfrm>
-                    <a:prstGeom prst="rect"/>
-                  </pic:spPr>
-                </pic:pic>
-              </a:graphicData>
-            </a:graphic>
-          </wp:inline>
-        </w:drawing>
-      </w:r>
-    </w:p>
-    <w:p>
-      <w:pPr>
-        <w:spacing w:after="60"/>
-      </w:pPr>
-      <w:r>
-        <w:rPr>
-          <w:sz w:val="18"/>
-        </w:rPr>
-        <w:t>Fonte: registro fotográfico fornecido pelo grupo.</w:t>
-      </w:r>
-    </w:p>
-    <w:p>
-      <w:r>
-        <w:br w:type="page"/>
-      </w:r>
-    </w:p>
-    <w:p>
-      <w:pPr>
-        <w:keepNext/>
-        <w:spacing w:before="120" w:after="100"/>
-      </w:pPr>
-      <w:r>
-        <w:rPr>
-          <w:sz w:val="20"/>
-        </w:rPr>
-        <w:t>Figura 7 – Esfera, suporte e plataforma de parada</w:t>
-      </w:r>
-    </w:p>
-    <w:p>
-      <w:pPr>
-        <w:spacing w:after="80"/>
-        <w:jc w:val="center"/>
-      </w:pPr>
-      <w:r>
-        <w:drawing>
-          <wp:inline xmlns:a="http://schemas.openxmlformats.org/drawingml/2006/main" xmlns:pic="http://schemas.openxmlformats.org/drawingml/2006/picture">
-            <wp:extent cx="2052000" cy="3648000"/>
-            <wp:docPr id="7" name="Picture 7"/>
-            <wp:cNvGraphicFramePr>
-              <a:graphicFrameLocks noChangeAspect="1"/>
-            </wp:cNvGraphicFramePr>
-            <a:graphic>
-              <a:graphicData uri="http://schemas.openxmlformats.org/drawingml/2006/picture">
-                <pic:pic>
-                  <pic:nvPicPr>
-                    <pic:cNvPr id="0" name="montagem_04.jpeg"/>
-                    <pic:cNvPicPr/>
-                  </pic:nvPicPr>
-                  <pic:blipFill>
-                    <a:blip r:embed="rId22"/>
-                    <a:stretch>
-                      <a:fillRect/>
-                    </a:stretch>
-                  </pic:blipFill>
-                  <pic:spPr>
-                    <a:xfrm>
-                      <a:off x="0" y="0"/>
-                      <a:ext cx="2052000" cy="3648000"/>
-                    </a:xfrm>
-                    <a:prstGeom prst="rect"/>
-                  </pic:spPr>
-                </pic:pic>
-              </a:graphicData>
-            </a:graphic>
-          </wp:inline>
-        </w:drawing>
-      </w:r>
-    </w:p>
-    <w:p>
-      <w:pPr>
-        <w:spacing w:after="60"/>
-      </w:pPr>
-      <w:r>
-        <w:rPr>
-          <w:sz w:val="18"/>
-        </w:rPr>
-        <w:t>Fonte: registro fotográfico fornecido pelo grupo.</w:t>
-      </w:r>
-    </w:p>
-    <w:p>
-      <w:pPr>
-        <w:keepNext/>
-        <w:spacing w:before="120" w:after="100"/>
-      </w:pPr>
-      <w:r>
-        <w:rPr>
-          <w:sz w:val="20"/>
-        </w:rPr>
-        <w:t>Figura 8 – Unidade de cronometragem</w:t>
-      </w:r>
-    </w:p>
-    <w:p>
-      <w:pPr>
-        <w:spacing w:after="80"/>
-        <w:jc w:val="center"/>
-      </w:pPr>
-      <w:r>
-        <w:drawing>
-          <wp:inline xmlns:a="http://schemas.openxmlformats.org/drawingml/2006/main" xmlns:pic="http://schemas.openxmlformats.org/drawingml/2006/picture">
-            <wp:extent cx="2052000" cy="3648000"/>
-            <wp:docPr id="8" name="Picture 8"/>
-            <wp:cNvGraphicFramePr>
-              <a:graphicFrameLocks noChangeAspect="1"/>
-            </wp:cNvGraphicFramePr>
-            <a:graphic>
-              <a:graphicData uri="http://schemas.openxmlformats.org/drawingml/2006/picture">
-                <pic:pic>
-                  <pic:nvPicPr>
-                    <pic:cNvPr id="0" name="montagem_02.jpeg"/>
-                    <pic:cNvPicPr/>
-                  </pic:nvPicPr>
-                  <pic:blipFill>
-                    <a:blip r:embed="rId23"/>
-                    <a:stretch>
-                      <a:fillRect/>
-                    </a:stretch>
-                  </pic:blipFill>
-                  <pic:spPr>
-                    <a:xfrm>
-                      <a:off x="0" y="0"/>
-                      <a:ext cx="2052000" cy="3648000"/>
-                    </a:xfrm>
-                    <a:prstGeom prst="rect"/>
-                  </pic:spPr>
-                </pic:pic>
-              </a:graphicData>
-            </a:graphic>
-          </wp:inline>
-        </w:drawing>
-      </w:r>
-    </w:p>
-    <w:p>
-      <w:pPr>
-        <w:spacing w:after="60"/>
-      </w:pPr>
-      <w:r>
-        <w:rPr>
-          <w:sz w:val="18"/>
-        </w:rPr>
-        <w:t>Fonte: registro fotográfico fornecido pelo grupo.</w:t>
-      </w:r>
-    </w:p>
     <w:sectPr>
-      <w:headerReference w:type="default" r:id="rId17"/>
-      <w:footerReference w:type="default" r:id="rId18"/>
+      <w:headerReference w:type="default" r:id="rId20"/>
+      <w:footerReference w:type="default" r:id="rId21"/>
       <w:pgSz w:w="11906" w:h="16838"/>
       <w:pgMar w:top="1701" w:right="1134" w:bottom="1134" w:left="1701" w:header="680" w:footer="709" w:gutter="0"/>
       <w:pgNumType w:start="5"/>

</xml_diff>

<commit_message>
Revisar linguagem e formatacao do relatorio EX03
</commit_message>
<xml_diff>
--- a/FisicaEx03/Relatorio_Final.docx
+++ b/FisicaEx03/Relatorio_Final.docx
@@ -239,7 +239,7 @@
     </w:p>
     <w:p>
       <w:r>
-        <w:t>Investigou-se a queda livre por meio de 51 leituras de tempo em 17 alturas entre 10 e 90 cm. Para cada altura, calculou-se o tempo médio e sua incerteza, combinando o desvio padrão da média com a contribuição instrumental de 0,0001 s. A altura foi tratada sem incerteza considerada, conforme o registro do experimento. A relação entre as grandezas foi analisada por linearização logarítmica e por ajuste de t² em função da altura. O ajuste de potência com expoente livre forneceu n = 2,108 ± 0,002 e C = (5,31 ± 0,01) m para d = C(t/1 s)ⁿ. Ao impor n = 2, os ajustes logarítmico e de t² pela origem forneceram, respectivamente, g = (9,468 ± 0,003) m/s² e g = (9,475 ± 0,003) m/s². Os qui-quadrados reduzidos, superiores a 300 nesses modelos restritos, mostram que suas incertezas formais não expressam a dispersão total dos dados. Um ajuste adicional com intercepto livre reduziu o qui-quadrado reduzido para 3,08 e forneceu g = (9,878 ± 0,007) m/s², sem identificar a origem física do intercepto. Os resultados caracterizam as medidas obtidas e os limites das hipóteses empregadas.</w:t>
+        <w:t>Neste experimento, medimos o tempo de queda de uma esfera em 17 alturas, entre 10 e 90 cm. Foram feitas três medidas em cada altura, totalizando 51 tempos. Para cada conjunto, calculamos a média e sua incerteza, considerando a variação entre as medidas e a contribuição instrumental de 0,0001 s. A altura foi usada sem incerteza, conforme a orientação para esta prática. Para estudar a relação entre altura e tempo, fizemos a linearização logarítmica e o ajuste de t² em função da altura. Com o expoente livre, encontramos n = 2,108 ± 0,002 e C = (5,31 ± 0,01) m na expressão d = C(t/1 s)ⁿ. Ao fixar n = 2, obtivemos g = (9,468 ± 0,003) m/s² pelo ajuste logarítmico e g = (9,475 ± 0,003) m/s² pelo ajuste de t² que passa pela origem. Esses ajustes deixaram resíduos muito maiores do que as incertezas adotadas. Um ajuste com intercepto livre deu g = (9,878 ± 0,007) m/s² e representou melhor os dados, embora não permita identificar a causa do intercepto. Assim, os valores de incerteza dos ajustes devem ser interpretados com cuidado.</w:t>
       </w:r>
     </w:p>
     <w:p>
@@ -921,17 +921,17 @@
     </w:p>
     <w:p>
       <w:r>
-        <w:t>A queda livre permite investigar a relação entre a distância percorrida e o tempo de movimento. Para uma esfera abandonada do repouso e submetida a aceleração constante, a descrição ideal prevê d = gt²/2. O roteiro do capítulo 12 da apostila propõe testar essa dependência com três medidas de tempo para cada altura, construir gráficos em escala original e após linearização e obter uma estimativa da aceleração (Iwamoto et al., 2014).</w:t>
+        <w:t>Na queda livre, a distância percorrida aumenta com o tempo. Se a esfera parte do repouso e a aceleração é constante, o modelo ideal prevê d = gt²/2. O capítulo 12 da apostila propõe medir o tempo de queda em diferentes alturas, fazer gráficos e estimar a aceleração da gravidade (Iwamoto et al., 2014).</w:t>
       </w:r>
     </w:p>
     <w:p>
       <w:r>
-        <w:t>Este relatório apresenta as 17 alturas medidas pelo grupo em 6 de outubro de 2026, de 10 a 90 cm, com três tempos por altura. O tratamento combina a dispersão das repetições com a contribuição instrumental do cronômetro e mantém a altura sem incerteza considerada, como informado para esta prática.</w:t>
+        <w:t>Neste trabalho, usamos as medidas feitas pelo grupo em 6 de outubro de 2026: três tempos para cada uma das 17 alturas, de 10 a 90 cm. Para calcular a incerteza do tempo médio, consideramos tanto a diferença entre as repetições quanto a contribuição de 0,0001 s do cronômetro. A altura foi tratada sem incerteza, conforme informado para esta prática.</w:t>
       </w:r>
     </w:p>
     <w:p>
       <w:r>
-        <w:t>A análise usa duas vias previstas no roteiro: a lei de potência com expoente estimado pelos dados e a relação quadrática imposta para obter a aceleração. Os gráficos, as tabelas e a discussão dos resíduos mostram tanto a tendência do movimento quanto os limites da precisão atribuída aos parâmetros.</w:t>
+        <w:t>Primeiro, ajustamos uma lei de potência para verificar como a altura varia com o tempo. Depois, fixamos a dependência quadrática prevista pelo modelo ideal para estimar g. Os gráficos e os resíduos ajudam a avaliar até que ponto esses modelos descrevem as medidas.</w:t>
       </w:r>
     </w:p>
     <w:p>
@@ -953,7 +953,7 @@
     </w:p>
     <w:p>
       <w:r>
-        <w:t>Para cada altura dᵢ, a média de três leituras tᵢⱼ é calculada sem arredondamento intermediário. O desvio padrão amostral sᵢ caracteriza a dispersão das repetições; sua contribuição para a média é sᵢ/√3. A contribuição instrumental informada, 0,0001 s, é combinada em quadratura, admitindo independência (Odashima, [s. d.]b; Iwamoto et al., 2014).</w:t>
+        <w:t>Para cada altura dᵢ, calculamos a média das três leituras tᵢⱼ sem arredondar durante as contas. O desvio padrão amostral sᵢ mostra quanto os tempos variaram entre si. Para a incerteza da média, combinamos sᵢ/√3 com a contribuição instrumental de 0,0001 s, supondo que sejam independentes (Odashima, [s. d.]b; Iwamoto et al., 2014).</w:t>
       </w:r>
     </w:p>
     <w:p>
@@ -1042,7 +1042,7 @@
         <w:jc w:val="center"/>
       </w:pPr>
       <w:r>
-        <w:t>Escreve-se a hipótese empírica como d = C(t̄/1 s)ⁿ, com C em metros e n adimensional. A transformação logarítmica produz ln(d/1 m) = ln(C/1 m) + n ln(t̄/1 s). No modelo ideal, n = 2, A = ln[g/(2 m/s²)] e g = (2 m/s²) exp(A), pela linearização direta. Como só o tempo recebeu incerteza no tratamento, a regressão ponderada é orientada no sentido inverso, mantendo o tempo no eixo vertical:</w:t>
+        <w:t>Para testar os dados, usamos a expressão d = C(t̄/1 s)ⁿ, em que C é dado em metros e n não tem unidade. Ao tomar o logaritmo, obtemos ln(d/1 m) = ln(C/1 m) + n ln(t̄/1 s), que tem a forma de uma reta. No modelo ideal, n = 2, A = ln[g/(2 m/s²)] e g = (2 m/s²) exp(A) quando a altura fica no eixo vertical. Como apenas o tempo recebeu incerteza neste trabalho, fizemos o ajuste ponderado com o tempo no eixo vertical:</w:t>
       </w:r>
     </w:p>
     <w:p>
@@ -1188,7 +1188,7 @@
     </w:p>
     <w:p>
       <w:r>
-        <w:t>Da reta inversa, n = 1/a e C = (1 m) exp(−b/a). A incerteza de C usa as incertezas de a e b e a covariância entre esses coeficientes. A transformação de logaritmos de razões torna X e Y adimensionais (Sousa, [s. d.]; Iwamoto et al., 2014).</w:t>
+        <w:t>Nesse ajuste inverso, n = 1/a e C = (1 m) exp(−b/a). Para calcular a incerteza de C, consideramos também a relação entre os valores ajustados de a e b, chamada covariância. Dividir d por 1 m e t̄ por 1 s antes de calcular os logaritmos deixa X e Y sem unidade (Sousa, [s. d.]; Iwamoto et al., 2014).</w:t>
       </w:r>
     </w:p>
     <w:p>
@@ -1201,7 +1201,7 @@
     </w:p>
     <w:p>
       <w:r>
-        <w:t>Para a hipótese de aceleração constante a partir do repouso, d = gt̄²/2. O ajuste numérico é feito com Q = t̄² em função de d, pois a incerteza propagada de Q é vertical. O gráfico de d por Q é apresentado na orientação solicitada pela apostila; os parâmetros são calculados pelo ajuste inverso.</w:t>
+        <w:t>Se a esfera parte do repouso e mantém aceleração constante, então d = gt̄²/2. Como a incerteza foi atribuída ao tempo, ajustamos Q = t̄² em função da altura d e propagamos a incerteza para Q. Também mostramos d em função de Q, como pede a apostila; os dois gráficos usam os mesmos dados.</w:t>
       </w:r>
     </w:p>
     <w:p>
@@ -1229,7 +1229,7 @@
     </w:p>
     <w:p>
       <w:r>
-        <w:t>A segunda estimativa de g impõe n = 2 na reta logarítmica: a = 1/2, b₂ é ajustado e g = (2 m/s²) exp(−2b₂). Para examinar a passagem pela origem, também se ajusta Q = ad + b, com b livre. O qui-quadrado reduzido avalia os resíduos em relação às incertezas consideradas.</w:t>
+        <w:t>Também estimamos g ao fixar n = 2 no ajuste logarítmico: nesse caso, a = 1/2, ajustamos b₂ e calculamos g = (2 m/s²) exp(−2b₂). Para verificar se a reta precisa passar pela origem, fizemos ainda o ajuste Q = ad + b, deixando b livre. O qui-quadrado reduzido compara as diferenças entre pontos e modelo com as incertezas usadas.</w:t>
       </w:r>
     </w:p>
     <w:p>
@@ -1243,12 +1243,12 @@
     </w:p>
     <w:p>
       <w:r>
-        <w:t>O roteiro do capítulo 12 descreve uma esfera metálica mantida por disparador eletromagnético, uma haste graduada, um cronômetro e uma plataforma de parada. A soltura inicia a contagem, encerrada no impacto. As fotografias fornecidas pelo grupo documentam a montagem utilizada e são apresentadas na Seção 3.1. Elas mostram a haste, o suporte da esfera, a base e a unidade de cronometragem, sem permitir concluir ajustes ou calibração que não foram registrados.</w:t>
+        <w:t>A montagem descrita no capítulo 12 usa uma esfera metálica presa por um disparador eletromagnético, uma haste graduada, uma plataforma de parada e um cronômetro. O cronômetro começa a contar quando a esfera é solta e para no impacto. As fotos do grupo, apresentadas na Seção 3.1, mostram a montagem, o suporte da esfera, a base e o cronômetro. Elas não mostram se houve algum ajuste ou calibração, por isso não fizemos afirmações sobre esses procedimentos.</w:t>
       </w:r>
     </w:p>
     <w:p>
       <w:r>
-        <w:t>O registro do experimento de 6 de outubro de 2026 contém 17 alturas de 10 a 90 cm, em incrementos de 5 cm, e três tempos por altura. A Tabela 1 reproduz a planilha conferida pelo grupo. As alturas anotadas em centímetros foram convertidas para metros antes dos ajustes. Não foi incluído o número 95, que aparecia apenas como rascunho na segunda folha.</w:t>
+        <w:t>O grupo anotou três tempos para cada uma das 17 alturas, de 10 a 90 cm, em passos de 5 cm. A Tabela 1 traz os valores conferidos pelo grupo. Para os ajustes, convertemos as alturas de centímetros para metros. O número 95, escrito como rascunho na segunda folha, não corresponde a uma medida e não foi incluído.</w:t>
       </w:r>
     </w:p>
     <w:p>
@@ -3647,7 +3647,7 @@
     </w:p>
     <w:p>
       <w:r>
-        <w:t>A altura foi tratada sem incerteza considerada, conforme orientação do grupo; isso não significa precisão física infinita. Para o tempo, empregou-se 0,0001 s de contribuição instrumental. As 51 leituras foram mantidas. As médias, incertezas e variáveis transformadas foram calculadas com precisão completa. Os gráficos foram produzidos pela ferramenta de criação de gráficos do projeto, com os dados e coeficientes desta análise.</w:t>
+        <w:t>Para este trabalho, não foi considerada incerteza da altura. Isso não quer dizer que a altura tenha precisão infinita. Para o tempo, usamos a contribuição instrumental de 0,0001 s. Mantivemos todas as 51 leituras e fizemos as contas sem arredondar os valores intermediários. Os gráficos foram feitos com os dados e os coeficientes calculados aqui.</w:t>
       </w:r>
     </w:p>
     <w:p>
@@ -3665,7 +3665,7 @@
         <w:spacing w:after="160"/>
       </w:pPr>
       <w:r>
-        <w:t>As imagens fornecidas pelo grupo registram o arranjo observado. Foram selecionadas três vistas complementares: o conjunto completo, a região de queda da esfera e a unidade de cronometragem.</w:t>
+        <w:t>Selecionamos três fotos do grupo para mostrar a montagem por ângulos diferentes: uma visão geral, a região por onde a esfera cai e o cronômetro.</w:t>
       </w:r>
     </w:p>
     <w:p>
@@ -3899,7 +3899,7 @@
     </w:p>
     <w:p>
       <w:r>
-        <w:t>A Tabela 2 apresenta o resultado estatístico das três repetições em cada altura. A incerteza instrumental entra uma vez no tempo médio; ela não é novamente dividida por √3. Como exemplo, para 10 cm, t̄ = (0,1580 + 0,1572 + 0,1580)/3 = 0,1577333 s, s = 0,0004619 s e u(t̄) = √[(0,0004619/√3)² + (0,0001)²] s = 0,0002848 s. O resultado arredondado é (0,1577 ± 0,0003) s.</w:t>
+        <w:t>A Tabela 2 mostra a média e a incerteza dos três tempos em cada altura. A contribuição instrumental de 0,0001 s entra uma vez no cálculo da incerteza da média. Por exemplo, para 10 cm, t̄ = (0,1580 + 0,1572 + 0,1580)/3 = 0,1577333 s, s = 0,0004619 s e u(t̄) = √[(0,0004619/√3)² + (0,0001)²] s = 0,0002848 s. Arredondando, temos (0,1577 ± 0,0003) s.</w:t>
       </w:r>
     </w:p>
     <w:p>
@@ -5923,7 +5923,7 @@
     </w:p>
     <w:p>
       <w:r>
-        <w:t>A Figura 4 mostra o crescimento da altura percorrida com o tempo médio. A curvatura é compatível qualitativamente com uma dependência superior à linear. As barras de tempo são pequenas na escala da figura, mas seus valores constam da Tabela 2.</w:t>
+        <w:t>Na Figura 4, a altura cresce cada vez mais rápido à medida que o tempo aumenta. As barras de incerteza do tempo são pequenas nessa escala; os valores numéricos estão na Tabela 2.</w:t>
       </w:r>
     </w:p>
     <w:p>
@@ -7961,7 +7961,7 @@
     </w:p>
     <w:p>
       <w:r>
-        <w:t>O ajuste livre fornece a = 0,4743309 e b = −0,7920544. A inversão da reta e a propagação com covariância fornecem n = 2,108 ± 0,002 e C = (5,31 ± 0,01) m. O qui-quadrado reduzido é 53,05, com 15 graus de liberdade. O expoente difere de 2 muito além da incerteza formal; não se interpreta 2C como uma aceleração constante.</w:t>
+        <w:t>O ajuste com expoente livre deu a = 0,4743309 e b = −0,7920544. A partir desses valores, obtivemos n = 2,108 ± 0,002 e C = (5,31 ± 0,01) m. O qui-quadrado reduzido foi 53,05, com 15 graus de liberdade. O valor de n ficou acima de 2 por muito mais do que a incerteza formal indica. Como o expoente não é 2, não podemos usar 2C como um valor único da aceleração.</w:t>
       </w:r>
     </w:p>
     <w:p>
@@ -8036,7 +8036,7 @@
     </w:p>
     <w:p>
       <w:r>
-        <w:t>O parâmetro C representa a altura extrapolada para t = 1 s, fora do intervalo de tempos medido. A Figura 6 devolve a lei ajustada à escala original. A curva acompanha a tendência, mas a magnitude dos resíduos requer cautela com as incertezas dos parâmetros.</w:t>
+        <w:t>C corresponde à altura prevista para t = 1 s, tempo maior que os medidos aqui. A Figura 6 mostra a curva ajustada na escala original. Ela acompanha a tendência dos pontos, mas as diferenças entre a curva e as medidas são grandes em relação às incertezas consideradas.</w:t>
       </w:r>
     </w:p>
     <w:p>
@@ -9554,7 +9554,7 @@
     </w:p>
     <w:p>
       <w:r>
-        <w:t>Fixando o expoente n = 2 no ajuste logarítmico, obtém-se g = (9,468 ± 0,003) m/s². O qui-quadrado reduzido é 347,18, com 16 graus de liberdade. No ajuste Q = a₀d pela origem, a₀ = 0,2110808 s²/m e g = (9,475 ± 0,003) m/s², com qui-quadrado reduzido 320,83.</w:t>
+        <w:t>Ao fixar n = 2 no ajuste logarítmico, encontramos g = (9,468 ± 0,003) m/s² e qui-quadrado reduzido de 347,18, com 16 graus de liberdade. No ajuste Q = a₀d passando pela origem, a₀ = 0,2110808 s²/m e g = (9,475 ± 0,003) m/s². Nesse caso, o qui-quadrado reduzido foi 320,83.</w:t>
       </w:r>
     </w:p>
     <w:p>
@@ -9629,7 +9629,7 @@
     </w:p>
     <w:p>
       <w:r>
-        <w:t>A Figura 7 apresenta d em função de t̄², conforme o roteiro. A inclinação correspondente à reta pela origem é A = 1/a₀ = 4,7375 m/s² e g = 2A. O valor da inclinação provém do ajuste ponderado de Q em função de d; a figura direta é uma representação dos mesmos pontos e parâmetros, sem uma segunda regressão independente.</w:t>
+        <w:t>A Figura 7 mostra d em função de t̄², como pede o roteiro. Para a reta que passa pela origem, A = 1/a₀ = 4,7375 m/s² e g = 2A. Calculamos essa inclinação a partir do ajuste ponderado de Q em função de d; o gráfico de d por Q apenas apresenta os mesmos pontos e parâmetros na orientação pedida.</w:t>
       </w:r>
     </w:p>
     <w:p>
@@ -9704,7 +9704,7 @@
     </w:p>
     <w:p>
       <w:r>
-        <w:t>Como diagnóstico, o modelo Q = ad + b com intercepto livre fornece a = 0,2024629 s²/m e b = (0,00448 ± 0,00006) s². Resulta g = (9,878 ± 0,007) m/s² e qui-quadrado reduzido 3,08, com 15 graus de liberdade. A Figura 8 mostra a orientação usada para ponderar pelas incertezas de Q.</w:t>
+        <w:t>Para verificar o efeito de permitir um intercepto, ajustamos Q = ad + b. Encontramos a = 0,2024629 s²/m e b = (0,00448 ± 0,00006) s², o que dá g = (9,878 ± 0,007) m/s². O qui-quadrado reduzido caiu para 3,08, com 15 graus de liberdade. A Figura 8 mostra Q em função de d, orientação usada nesse ajuste.</w:t>
       </w:r>
     </w:p>
     <w:p>
@@ -10164,17 +10164,17 @@
     </w:p>
     <w:p>
       <w:r>
-        <w:t>Os dois modelos com n = 2 produzem valores numéricos próximos, mas derivam das mesmas medições e não constituem confirmações independentes. Os elevados qui-quadrados reduzidos mostram que os resíduos superam amplamente a escala de incerteza adotada. Assim, as incertezas pequenas de g refletem apenas a fórmula do ajuste sob as hipóteses usadas, sem demonstrar precisão física de milésimos de m/s².</w:t>
+        <w:t>Os dois ajustes com n = 2 deram valores próximos de g, mas usaram as mesmas medidas. Portanto, essa concordância não é uma confirmação independente. Em ambos, o qui-quadrado reduzido ficou muito alto: as diferenças entre pontos e modelo foram bem maiores do que as incertezas adotadas. Assim, a incerteza de 0,003 m/s² é apenas a incerteza calculada pelo ajuste, e não a precisão real demonstrada pelo experimento.</w:t>
       </w:r>
     </w:p>
     <w:p>
       <w:r>
-        <w:t>O intercepto livre reduz fortemente os resíduos. Ele pode parametrizar um deslocamento efetivo de referência ou outro desvio do modelo simples, mas as medições disponíveis não identificam sua causa. Não se alteraram as alturas nem se eliminaram pontos para forçar concordância. A altura sem incerteza considerada, possíveis atrasos do acionamento e diferenças na soltura são limitações que exigiriam dados adicionais para avaliação quantitativa.</w:t>
+        <w:t>Deixar o intercepto livre aproximou melhor a reta dos pontos. Esse intercepto pode estar ligado a um deslocamento da referência de altura ou a outro efeito não descrito pelo modelo simples, mas os dados não permitem descobrir sua causa. Não mudamos alturas nem retiramos pontos para melhorar o resultado. Medir a incerteza da altura e investigar possíveis atrasos na soltura ou na detecção ajudaria a entender a diferença.</w:t>
       </w:r>
     </w:p>
     <w:p>
       <w:r>
-        <w:t>A relação empírica com expoente livre descreve o intervalo observado, aproximadamente 0,158 a 0,433 s. Para n ≠ 2, a aceleração obtida pela segunda derivada da lei de potência depende do tempo. Por isso, essa relação não fornece um único valor de g sem a hipótese adicional n = 2. Os resultados do ajuste quadrático devem ser lidos como estimativas condicionais a essa hipótese.</w:t>
+        <w:t>A lei de potência com expoente livre descreve os tempos medidos, aproximadamente de 0,158 a 0,433 s. Quando n é diferente de 2, a aceleração calculada por essa lei muda com o tempo. Por isso, não há um único valor de g nesse ajuste. Os valores obtidos ao fixar n = 2 dependem dessa hipótese.</w:t>
       </w:r>
     </w:p>
     <w:p>
@@ -10188,12 +10188,12 @@
     </w:p>
     <w:p>
       <w:r>
-        <w:t>As 51 leituras de tempo permitiram organizar 17 pares de altura e tempo médio, propagar a contribuição estatística e a contribuição instrumental de 0,0001 s e construir os gráficos pedidos no capítulo 12. O ajuste de potência forneceu n = 2,108 ± 0,002 e C = (5,31 ± 0,01) m. Sob a hipótese quadrática, o ajuste de t̄² pela origem forneceu g = (9,475 ± 0,003) m/s²; a via logarítmica com n fixo em 2 forneceu g = (9,468 ± 0,003) m/s².</w:t>
+        <w:t>As 51 medidas de tempo, feitas em 17 alturas, permitiram calcular médias e incertezas e construir os gráficos pedidos no capítulo 12. No ajuste de potência, encontramos n = 2,108 ± 0,002 e C = (5,31 ± 0,01) m. Ao usar o modelo quadrático, obtivemos g = (9,475 ± 0,003) m/s² pelo ajuste de t̄² que passa pela origem e g = (9,468 ± 0,003) m/s² pelo ajuste logarítmico com n = 2.</w:t>
       </w:r>
     </w:p>
     <w:p>
       <w:r>
-        <w:t>Os elevados qui-quadrados reduzidos dos modelos restritos impedem interpretar essas incertezas formais como precisão física do experimento. A inclusão de um intercepto em t̄² por d melhora o ajuste, mas não identifica a causa do desvio. Uma avaliação futura da incerteza da altura e de efeitos sistemáticos do disparo e da detecção permitiria testar com mais segurança o modelo ideal de queda livre.</w:t>
+        <w:t>Esses dois ajustes deixaram diferenças grandes entre os pontos e o modelo, por isso suas pequenas incertezas não representam toda a variação observada. Permitir um intercepto melhorou o ajuste, mas não revelou a causa da diferença. Em outra medição, seria útil avaliar a incerteza da altura e verificar se a soltura e a parada do cronômetro introduzem atrasos.</w:t>
       </w:r>
     </w:p>
     <w:p>

</xml_diff>